<commit_message>
MAPGEN Studio 2.2 (source fe3bda01f)
Co-Authored-By: Claude Opus 5.5 <noreply@anthropic.com>
</commit_message>
<xml_diff>
--- a/doc/mapgen_studio/MAPGEN_Studio_Guide_EN.docx
+++ b/doc/mapgen_studio/MAPGEN_Studio_Guide_EN.docx
@@ -1255,6 +1255,20 @@
       </w:r>
     </w:p>
     <w:p>
+      <w:pPr>
+        <w:pStyle w:val="ListBullet"/>
+      </w:pPr>
+      <w:r>
+        <w:rPr>
+          <w:b/>
+        </w:rPr>
+        <w:t>Updates</w:t>
+      </w:r>
+      <w:r>
+        <w:t xml:space="preserve"> — «Check for updates automatically» (on) and «Check for updates». When GitHub has a newer version, the program shows its number and all the changes (newest on top) and asks: «Yes» downloads, checks and installs it (your maps and settings stay; the program restarts and shows «What's new»), «Cancel» — not now, and it asks again at the next start.</w:t>
+      </w:r>
+    </w:p>
+    <w:p>
       <w:r>
         <w:t>The settings are kept in a file beside the program; where exactly is written at the bottom of the page.</w:t>
       </w:r>
@@ -1320,7 +1334,7 @@
     </w:p>
     <w:p>
       <w:r>
-        <w:t>The program's version and the version history: what changed in each, the newest on top.</w:t>
+        <w:t>The program's version, «Check for updates» and the version history: what changed in each, the newest on top.</w:t>
       </w:r>
     </w:p>
     <w:p>

</xml_diff>

<commit_message>
MAPGEN Studio 2.3 (source 4d911175f)
Co-Authored-By: Claude Opus 5.5 <noreply@anthropic.com>
</commit_message>
<xml_diff>
--- a/doc/mapgen_studio/MAPGEN_Studio_Guide_EN.docx
+++ b/doc/mapgen_studio/MAPGEN_Studio_Guide_EN.docx
@@ -601,6 +601,34 @@
       </w:r>
       <w:r>
         <w:t xml:space="preserve"> — three sliders. By default the generator decides; 0 adds none of that liquid; 100 fills every room it can. The generator floods only rooms with a level floor and no room underneath, and never cuts off an item or a way. Lava and slime stay away from the player starts; passages between rooms are flooded with water only.</w:t>
+      </w:r>
+    </w:p>
+    <w:p>
+      <w:pPr>
+        <w:pStyle w:val="ListBullet"/>
+      </w:pPr>
+      <w:r>
+        <w:rPr>
+          <w:b/>
+        </w:rPr>
+        <w:t>Stairway annexes</w:t>
+      </w:r>
+      <w:r>
+        <w:t xml:space="preserve"> — from «None» to 10. The generator builds flights of steps along rooms' walls up to new landings 128-192 high: a pickup of that part of the map stands on a landing, or a landing meets a ledge. It finds the places on any base by itself - a level blank wall and free floor before it; when the map has fewer such walls than asked, there are fewer stairways, and the map's description says so.</w:t>
+      </w:r>
+    </w:p>
+    <w:p>
+      <w:pPr>
+        <w:pStyle w:val="ListBullet"/>
+      </w:pPr>
+      <w:r>
+        <w:rPr>
+          <w:b/>
+        </w:rPr>
+        <w:t>Destruction</w:t>
+      </w:r>
+      <w:r>
+        <w:t xml:space="preserve"> — a slider from 0 to 100 %. At 0 the map is made as usual, with every passage check. The higher, the more is destroyed: cracks in walls and floors, rubble, craters, breaches in walls, broken ledge edges, fallen ceilings, blocked corridors; at 100 almost the whole level. The player starts always stay free and no pickup is buried; passage, though, is not guaranteed. For the ruin the generator uses its own texture pack (earth, stone, concrete, brick, metal, gravel and more) matched to the map's own colours; the pack goes into the game's folder with the map.</w:t>
       </w:r>
     </w:p>
     <w:p>

</xml_diff>

<commit_message>
MAPGEN Studio 2.5 (source 7a522d142)
Co-Authored-By: Claude Opus 5.5 <noreply@anthropic.com>
</commit_message>
<xml_diff>
--- a/doc/mapgen_studio/MAPGEN_Studio_Guide_EN.docx
+++ b/doc/mapgen_studio/MAPGEN_Studio_Guide_EN.docx
@@ -721,7 +721,7 @@
         <w:t>The stages</w:t>
       </w:r>
       <w:r>
-        <w:t>: Getting ready → Building the base map → Making the plan of edits → Edits → Checking it is playable → Light and visibility → The map's checks → Cover → Done. The stage under way shows its time; a finished one, when it ended.</w:t>
+        <w:t>: Getting ready → Building the base map → Making the plan of edits → Edits → Checking it is playable → Light and visibility → The map's checks → (Destruction - when asked for) → Cover → Done. The stage under way shows its time; a finished one, when it ended.</w:t>
       </w:r>
     </w:p>
     <w:p>
@@ -749,7 +749,7 @@
         <w:t>Done of the plan</w:t>
       </w:r>
       <w:r>
-        <w:t xml:space="preserve"> — what of the plan was built: new passages, annexes, pools, windows, rooms from the second map.</w:t>
+        <w:t xml:space="preserve"> — what of the plan was built: new passages, annexes, pools, windows, stairway annexes, rooms from the second map. Destruction comes after the edits and the checks; its percent is named in the plan's line.</w:t>
       </w:r>
     </w:p>
     <w:p>
@@ -763,7 +763,7 @@
         <w:t>The map's scheme</w:t>
       </w:r>
       <w:r>
-        <w:t xml:space="preserve"> — the plan from above or at a slant, with the accepted changes on it and, at the light stage, how the map is lit. «Full screen» puts the scheme on the whole screen; while it is there, the program's window is hidden.</w:t>
+        <w:t xml:space="preserve"> — the plan from above or at a slant, with the accepted changes on it (stairway annexes too, and, at the destruction stage, every crater, breach, fallen ceiling and debris pile as it is built) and, at the light stage, how the map is lit. «Full screen» puts the scheme on the whole screen; while it is there, the program's window is hidden.</w:t>
       </w:r>
     </w:p>
     <w:p>

</xml_diff>

<commit_message>
MAPGEN Studio 3.33 (source d4dbda139)
Co-Authored-By: Claude Opus 5.5 <noreply@anthropic.com>
</commit_message>
<xml_diff>
--- a/doc/mapgen_studio/MAPGEN_Studio_Guide_EN.docx
+++ b/doc/mapgen_studio/MAPGEN_Studio_Guide_EN.docx
@@ -93,6 +93,11 @@
       </w:pPr>
       <w:r>
         <w:t>First start</w:t>
+      </w:r>
+    </w:p>
+    <w:p>
+      <w:r>
+        <w:t>While the Studio is loading, a loading window shows how much is done and what is being done now (the window look, reading the map library, the newest map's cover, finding Python and the game, loading the Studio). The share is weighed by how long each step took at the last start, so on a slow computer or disk the bar moves as that machine loads. The first start after installing takes longer than usual.</w:t>
       </w:r>
     </w:p>
     <w:p>
@@ -148,7 +153,57 @@
     </w:p>
     <w:p>
       <w:r>
-        <w:t>The home page says whether the program is ready:</w:t>
+        <w:t xml:space="preserve">On the left is the menu: </w:t>
+      </w:r>
+      <w:r>
+        <w:rPr>
+          <w:b/>
+        </w:rPr>
+        <w:t>Home</w:t>
+      </w:r>
+      <w:r>
+        <w:t xml:space="preserve">, </w:t>
+      </w:r>
+      <w:r>
+        <w:rPr>
+          <w:b/>
+        </w:rPr>
+        <w:t>Generate</w:t>
+      </w:r>
+      <w:r>
+        <w:t xml:space="preserve">, </w:t>
+      </w:r>
+      <w:r>
+        <w:rPr>
+          <w:b/>
+        </w:rPr>
+        <w:t>Maps</w:t>
+      </w:r>
+      <w:r>
+        <w:t xml:space="preserve">, and at the bottom </w:t>
+      </w:r>
+      <w:r>
+        <w:rPr>
+          <w:b/>
+        </w:rPr>
+        <w:t>Settings</w:t>
+      </w:r>
+      <w:r>
+        <w:t xml:space="preserve"> and </w:t>
+      </w:r>
+      <w:r>
+        <w:rPr>
+          <w:b/>
+        </w:rPr>
+        <w:t>About</w:t>
+      </w:r>
+      <w:r>
+        <w:t>. Each section has its coloured sign; the one under the mouse lights up, the open one stands out in its colour with a bar on the left. The ☰ button at the top folds the menu to its signs and opens it again.</w:t>
+      </w:r>
+    </w:p>
+    <w:p>
+      <w:r>
+        <w:t>On the home page:</w:t>
       </w:r>
     </w:p>
     <w:p>
@@ -159,10 +214,93 @@
         <w:rPr>
           <w:b/>
         </w:rPr>
-        <w:t>Game client</w:t>
-      </w:r>
-      <w:r>
-        <w:t xml:space="preserve"> — the folder with the game. If none is chosen, press «Open settings» and point at the folder that holds </w:t>
+        <w:t>Two paragraphs on the Studio and its generator</w:t>
+      </w:r>
+      <w:r>
+        <w:t xml:space="preserve"> — what they do and why what comes out is always playable.</w:t>
+      </w:r>
+    </w:p>
+    <w:p>
+      <w:pPr>
+        <w:pStyle w:val="ListBullet"/>
+      </w:pPr>
+      <w:r>
+        <w:rPr>
+          <w:b/>
+        </w:rPr>
+        <w:t>The community's links</w:t>
+      </w:r>
+      <w:r>
+        <w:t xml:space="preserve"> under them: </w:t>
+      </w:r>
+      <w:r>
+        <w:rPr>
+          <w:b/>
+        </w:rPr>
+        <w:t>News</w:t>
+      </w:r>
+      <w:r>
+        <w:t xml:space="preserve"> (the Telegram channel, https://t.me/Q2RTX), </w:t>
+      </w:r>
+      <w:r>
+        <w:rPr>
+          <w:b/>
+        </w:rPr>
+        <w:t>Community group</w:t>
+      </w:r>
+      <w:r>
+        <w:t xml:space="preserve"> (the Telegram group, https://t.me/Q2PROX) and </w:t>
+      </w:r>
+      <w:r>
+        <w:rPr>
+          <w:b/>
+        </w:rPr>
+        <w:t>Site</w:t>
+      </w:r>
+      <w:r>
+        <w:t xml:space="preserve"> (https://q2pro-x.com/); they open in the browser.</w:t>
+      </w:r>
+    </w:p>
+    <w:p>
+      <w:pPr>
+        <w:pStyle w:val="ListBullet"/>
+      </w:pPr>
+      <w:r>
+        <w:rPr>
+          <w:b/>
+        </w:rPr>
+        <w:t>Three large buttons</w:t>
+      </w:r>
+      <w:r>
+        <w:t>: «New map» — to the generation, «Maps» — to the library (the button says how many maps it holds), «Guide» — opens this guide.</w:t>
+      </w:r>
+    </w:p>
+    <w:p>
+      <w:pPr>
+        <w:pStyle w:val="ListBullet"/>
+      </w:pPr>
+      <w:r>
+        <w:rPr>
+          <w:b/>
+        </w:rPr>
+        <w:t>The latest map</w:t>
+      </w:r>
+      <w:r>
+        <w:t xml:space="preserve"> — the newest map in the library: its cover, base, checks and «Open the map». While a run goes on, what it is doing now and «Open the run» stand there instead.</w:t>
+      </w:r>
+    </w:p>
+    <w:p>
+      <w:pPr>
+        <w:pStyle w:val="ListBullet"/>
+      </w:pPr>
+      <w:r>
+        <w:rPr>
+          <w:b/>
+        </w:rPr>
+        <w:t>Readiness</w:t>
+      </w:r>
+      <w:r>
+        <w:t xml:space="preserve"> — whether everything is set: the game client (the game's folder that holds </w:t>
       </w:r>
       <w:r>
         <w:rPr>
@@ -173,21 +311,7 @@
         <w:t>baseq2</w:t>
       </w:r>
       <w:r>
-        <w:t>.</w:t>
-      </w:r>
-    </w:p>
-    <w:p>
-      <w:pPr>
-        <w:pStyle w:val="ListBullet"/>
-      </w:pPr>
-      <w:r>
-        <w:rPr>
-          <w:b/>
-        </w:rPr>
-        <w:t>Generator</w:t>
-      </w:r>
-      <w:r>
-        <w:t xml:space="preserve"> — the </w:t>
+        <w:t xml:space="preserve">), the generator (the </w:t>
       </w:r>
       <w:r>
         <w:rPr>
@@ -198,7 +322,7 @@
         <w:t>engine</w:t>
       </w:r>
       <w:r>
-        <w:t xml:space="preserve"> folder beside the program. It is part of the build; if it is missing, the build is damaged.</w:t>
+        <w:t xml:space="preserve"> folder beside the program; without it the build is damaged), Python and the finished maps' checks. When something is missing, the button to fix it is right there: «Open settings», «Install Python», «Point to Python…».</w:t>
       </w:r>
     </w:p>
     <w:p>
@@ -209,10 +333,21 @@
         <w:rPr>
           <w:b/>
         </w:rPr>
-        <w:t>The finished maps' checks</w:t>
-      </w:r>
-      <w:r>
-        <w:t xml:space="preserve"> — whether Python was found. When not, «Install Python» and «Point to Python…» are right there.</w:t>
+        <w:t>Documentation</w:t>
+      </w:r>
+      <w:r>
+        <w:t xml:space="preserve"> — the guide comes with the program (the </w:t>
+      </w:r>
+      <w:r>
+        <w:rPr>
+          <w:rFonts w:ascii="Consolas" w:hAnsi="Consolas"/>
+          <w:color w:val="404040"/>
+          <w:sz w:val="19"/>
+        </w:rPr>
+        <w:t>doc</w:t>
+      </w:r>
+      <w:r>
+        <w:t xml:space="preserve"> folder beside it) and opens without the internet: in the browser, in Word, in Russian; «What is new» — the versions' history; the documentation folder.</w:t>
       </w:r>
     </w:p>
     <w:p>
@@ -223,15 +358,21 @@
         <w:rPr>
           <w:b/>
         </w:rPr>
-        <w:t>Maps in the library</w:t>
-      </w:r>
-      <w:r>
-        <w:t xml:space="preserve"> — how many maps have been made.</w:t>
+        <w:t>How to make a map</w:t>
+      </w:r>
+      <w:r>
+        <w:t xml:space="preserve"> — four steps.</w:t>
       </w:r>
     </w:p>
     <w:p>
       <w:r>
-        <w:t>Three buttons lead to the main sections: «Make a map», «Open the library», «Open settings». The same sections are in the menu on the left: Home, Generate, Maps, Settings, About.</w:t>
+        <w:rPr>
+          <w:b/>
+        </w:rPr>
+        <w:t>The run strip.</w:t>
+      </w:r>
+      <w:r>
+        <w:t xml:space="preserve"> While a run goes on, a strip stands over every page but the run's own: the map's name and its base, what is going on now and how long is left, the difference from the base, how many edits were accepted and how many builds made, a bar and «Open the run» (a click on the strip does the same). Once the run is over, the strip stays until you look at its page.</w:t>
       </w:r>
     </w:p>
     <w:p>
@@ -294,6 +435,101 @@
       </w:r>
     </w:p>
     <w:p>
+      <w:r>
+        <w:t xml:space="preserve">The page is laid out in cards, two columns. At the top left — </w:t>
+      </w:r>
+      <w:r>
+        <w:rPr>
+          <w:b/>
+        </w:rPr>
+        <w:t>Base map</w:t>
+      </w:r>
+      <w:r>
+        <w:t xml:space="preserve">; beside it on the right — </w:t>
+      </w:r>
+      <w:r>
+        <w:rPr>
+          <w:b/>
+        </w:rPr>
+        <w:t>The new map</w:t>
+      </w:r>
+      <w:r>
+        <w:t xml:space="preserve"> (likeness to the base, the generation's time, the variant number, the name) and </w:t>
+      </w:r>
+      <w:r>
+        <w:rPr>
+          <w:b/>
+        </w:rPr>
+        <w:t>The finished map</w:t>
+      </w:r>
+      <w:r>
+        <w:t xml:space="preserve"> (keep its source, take covers by itself). The bases' card is as tall as the two cards beside it together; when the list holds more maps than fit, it scrolls inside the card. Under them are the generation's options, cards by group, two in a row and one height: </w:t>
+      </w:r>
+      <w:r>
+        <w:rPr>
+          <w:b/>
+        </w:rPr>
+        <w:t>The base's frame</w:t>
+      </w:r>
+      <w:r>
+        <w:t xml:space="preserve"> and </w:t>
+      </w:r>
+      <w:r>
+        <w:rPr>
+          <w:b/>
+        </w:rPr>
+        <w:t>New rooms</w:t>
+      </w:r>
+      <w:r>
+        <w:t xml:space="preserve">, </w:t>
+      </w:r>
+      <w:r>
+        <w:rPr>
+          <w:b/>
+        </w:rPr>
+        <w:t>The base rebuilt</w:t>
+      </w:r>
+      <w:r>
+        <w:t xml:space="preserve"> and </w:t>
+      </w:r>
+      <w:r>
+        <w:rPr>
+          <w:b/>
+        </w:rPr>
+        <w:t>Water, slime, lava</w:t>
+      </w:r>
+      <w:r>
+        <w:t xml:space="preserve">, </w:t>
+      </w:r>
+      <w:r>
+        <w:rPr>
+          <w:b/>
+        </w:rPr>
+        <w:t>Ruin</w:t>
+      </w:r>
+      <w:r>
+        <w:t xml:space="preserve"> and </w:t>
+      </w:r>
+      <w:r>
+        <w:rPr>
+          <w:b/>
+        </w:rPr>
+        <w:t>What may change</w:t>
+      </w:r>
+      <w:r>
+        <w:t xml:space="preserve">. At the page's foot, wherever you are on the page, the line «The map … will be made: base …, likeness …, up to … min» and the </w:t>
+      </w:r>
+      <w:r>
+        <w:rPr>
+          <w:b/>
+        </w:rPr>
+        <w:t>«Start generating»</w:t>
+      </w:r>
+      <w:r>
+        <w:t xml:space="preserve"> button.</w:t>
+      </w:r>
+    </w:p>
+    <w:p>
       <w:pPr>
         <w:pStyle w:val="Heading2"/>
       </w:pPr>
@@ -398,6 +634,89 @@
       </w:r>
       <w:r>
         <w:t xml:space="preserve"> + likeness + variant number.</w:t>
+      </w:r>
+    </w:p>
+    <w:p>
+      <w:pPr>
+        <w:pStyle w:val="Heading2"/>
+      </w:pPr>
+      <w:r>
+        <w:t>The base's frame</w:t>
+      </w:r>
+    </w:p>
+    <w:p>
+      <w:r>
+        <w:t>Before building anything onto it, the generator may change the base itself:</w:t>
+      </w:r>
+    </w:p>
+    <w:p>
+      <w:pPr>
+        <w:pStyle w:val="ListBullet"/>
+      </w:pPr>
+      <w:r>
+        <w:rPr>
+          <w:b/>
+        </w:rPr>
+        <w:t>Size</w:t>
+      </w:r>
+      <w:r>
+        <w:t xml:space="preserve"> — the new map's area against the base's, 10 to 1000 %. A map made larger grows as tall, in proportion: halls become taller as well as wider. The steps and ledges that could no longer be climbed get gentle ramps or small flights in front of them; the gaps in gratings a player could not fall through are bridged; lifts and jump pads follow the new height. When full height leaves somewhere unwalkable, the generator tries a little less height until the whole map walks. A map made smaller keeps its height. Items and players' starts stay at their own height over the floor. The light of a large map is computed with a step chosen for its size — a map made several times larger does not come out dark.</w:t>
+      </w:r>
+    </w:p>
+    <w:p>
+      <w:pPr>
+        <w:pStyle w:val="ListBullet"/>
+      </w:pPr>
+      <w:r>
+        <w:rPr>
+          <w:b/>
+        </w:rPr>
+        <w:t>Spread</w:t>
+      </w:r>
+      <w:r>
+        <w:t xml:space="preserve"> — how unequally the base's parts stretch.</w:t>
+      </w:r>
+    </w:p>
+    <w:p>
+      <w:pPr>
+        <w:pStyle w:val="ListBullet"/>
+      </w:pPr>
+      <w:r>
+        <w:rPr>
+          <w:b/>
+        </w:rPr>
+        <w:t>Shift</w:t>
+      </w:r>
+      <w:r>
+        <w:t xml:space="preserve"> — how far the parts slide sideways against each other.</w:t>
+      </w:r>
+    </w:p>
+    <w:p>
+      <w:pPr>
+        <w:pStyle w:val="ListBullet"/>
+      </w:pPr>
+      <w:r>
+        <w:rPr>
+          <w:b/>
+        </w:rPr>
+        <w:t>Turn</w:t>
+      </w:r>
+      <w:r>
+        <w:t xml:space="preserve"> — the whole base turned or mirrored.</w:t>
+      </w:r>
+    </w:p>
+    <w:p>
+      <w:pPr>
+        <w:pStyle w:val="ListBullet"/>
+      </w:pPr>
+      <w:r>
+        <w:rPr>
+          <w:b/>
+        </w:rPr>
+        <w:t>Ceiling height</w:t>
+      </w:r>
+      <w:r>
+        <w:t xml:space="preserve"> — over the proportional height: everything above the highest place a player can stand is lifted further. 100 % — in proportion to the map's size. On a very large map the ceilings may run out of room — the game's coordinates are limited; they then rise as far as the game holds, and the run's log says so in a line like «The ceilings rose to 134 % of the 200 % asked: the game's coordinates hold no more».</w:t>
       </w:r>
     </w:p>
     <w:p>
@@ -456,12 +775,48 @@
           <w:i/>
           <w:sz w:val="18"/>
         </w:rPr>
-        <w:t>Scope of the changes</w:t>
+        <w:t>The generation's options</w:t>
       </w:r>
     </w:p>
     <w:p>
       <w:r>
-        <w:t>«Scope of the changes» opens the extra options. Each has a «Default» — then the generator decides by the likeness. Any other value is your direct order:</w:t>
+        <w:t xml:space="preserve">How much of what to build is set by the cards under the base: </w:t>
+      </w:r>
+      <w:r>
+        <w:rPr>
+          <w:b/>
+        </w:rPr>
+        <w:t>New rooms</w:t>
+      </w:r>
+      <w:r>
+        <w:t xml:space="preserve"> (passages, annexes, halls, bridges, stairways), </w:t>
+      </w:r>
+      <w:r>
+        <w:rPr>
+          <w:b/>
+        </w:rPr>
+        <w:t>The base rebuilt</w:t>
+      </w:r>
+      <w:r>
+        <w:t xml:space="preserve"> (walls, blocks, the floor, stairs, ornaments), </w:t>
+      </w:r>
+      <w:r>
+        <w:rPr>
+          <w:b/>
+        </w:rPr>
+        <w:t>Water, slime, lava</w:t>
+      </w:r>
+      <w:r>
+        <w:t xml:space="preserve"> and </w:t>
+      </w:r>
+      <w:r>
+        <w:rPr>
+          <w:b/>
+        </w:rPr>
+        <w:t>Ruin</w:t>
+      </w:r>
+      <w:r>
+        <w:t>. Each option has a «Default» — then the generator decides by the likeness. Any other value is your direct order:</w:t>
       </w:r>
     </w:p>
     <w:p>
@@ -614,7 +969,7 @@
         <w:t>Stairway annexes</w:t>
       </w:r>
       <w:r>
-        <w:t xml:space="preserve"> — from «None» to 10. The generator builds flights of steps along rooms' walls up to new landings 128-192 high: a pickup of that part of the map stands on a landing, or a landing meets a ledge. It finds the places on any base by itself - a level blank wall and free floor before it; when the map has fewer such walls than asked, there are fewer stairways, and the map's description says so.</w:t>
+        <w:t xml:space="preserve"> — from «None» to 10. The generator builds new platforms 96-192 high with stairs up to them: along rooms' walls and standing free on open floor (at most half of them). A pickup of that part of the map stands on each, or, by a wall, the platform leads onto a ledge of the map. It finds the places on any base by itself - a level floor, room around it and above it; when the map has fewer places than asked, there are fewer platforms, and the map's description says so.</w:t>
       </w:r>
     </w:p>
     <w:p>
@@ -625,25 +980,118 @@
         <w:rPr>
           <w:b/>
         </w:rPr>
-        <w:t>Destruction</w:t>
-      </w:r>
-      <w:r>
-        <w:t xml:space="preserve"> — a slider from 0 to 100 %. At 0 the map is made as usual, with every passage check. The higher, the more is destroyed: cracks in walls and floors, rubble, craters, breaches in walls, broken ledge edges, fallen ceilings, blocked corridors; at 100 almost the whole level. The player starts always stay free and no pickup is buried; passage, though, is not guaranteed. For the ruin the generator uses its own texture pack (earth, stone, concrete, brick, metal, gravel and more) matched to the map's own colours; the pack goes into the game's folder with the map.</w:t>
+        <w:t>Remodel the base</w:t>
+      </w:r>
+      <w:r>
+        <w:t xml:space="preserve"> — how many times to change the base map itself rather than build onto it: a room's wall moved in, a wall turned at an angle, a terrace with steps raised along a wall.</w:t>
       </w:r>
     </w:p>
     <w:p>
-      <w:r>
-        <w:t>«What may change» lists the families of changes; any can be switched off.</w:t>
+      <w:pPr>
+        <w:pStyle w:val="ListBullet"/>
+      </w:pPr>
+      <w:r>
+        <w:rPr>
+          <w:b/>
+        </w:rPr>
+        <w:t>Blocks in the rooms</w:t>
+      </w:r>
+      <w:r>
+        <w:t xml:space="preserve"> — how many blocks to stand in the base's own rooms: a box, an L, a cross, an octagon or a round one, 64 to 192 across, turned at different angles. Low ones (32-64) to climb, high ones (96-128) a cover; against a wall or free, in the room's own material.</w:t>
       </w:r>
     </w:p>
     <w:p>
-      <w:r>
-        <w:t>«Keep the map source (.map)» leaves the source beside the finished map, for a map editor.</w:t>
+      <w:pPr>
+        <w:pStyle w:val="ListBullet"/>
+      </w:pPr>
+      <w:r>
+        <w:rPr>
+          <w:b/>
+        </w:rPr>
+        <w:t>Floor: daises and channels</w:t>
+      </w:r>
+      <w:r>
+        <w:t xml:space="preserve"> — how many times to change the base's own floor: raise a dais stepped on every side (a box or an octagon, 32-80 high) or sink a channel across the floor (32-64 deep) with a flight at both ends. A channel is dug only where no other room lies under the floor; the arena first.</w:t>
       </w:r>
     </w:p>
     <w:p>
-      <w:r>
-        <w:t>«Start generating» starts the work.</w:t>
+      <w:pPr>
+        <w:pStyle w:val="ListBullet"/>
+      </w:pPr>
+      <w:r>
+        <w:rPr>
+          <w:b/>
+        </w:rPr>
+        <w:t>Rebuild the base's stairs</w:t>
+      </w:r>
+      <w:r>
+        <w:t xml:space="preserve"> — how many of the base's own stairs to rebuild in another shape between the same two floors: the old flight becomes a landing, reached by a half-round foot of steps or by a side flight. It needs open flat floor in front of the stair.</w:t>
+      </w:r>
+    </w:p>
+    <w:p>
+      <w:r>
+        <w:t>For all four «Default» lets the generator decide by the likeness (the less alike, the more changes). When a map offers fewer places than asked, fewer are made, and the map's description says so.</w:t>
+      </w:r>
+    </w:p>
+    <w:p>
+      <w:pPr>
+        <w:pStyle w:val="ListBullet"/>
+      </w:pPr>
+      <w:r>
+        <w:rPr>
+          <w:b/>
+        </w:rPr>
+        <w:t>Destruction</w:t>
+      </w:r>
+      <w:r>
+        <w:t xml:space="preserve"> — a slider from 0 to 100 %. At 0 the map is made as usual, with every passage check. The higher, the more is destroyed: cracks in walls and floors, rubble, craters, breaches in walls, broken ledge edges, fallen ceilings, blocked corridors; at 100 almost the whole level. The player starts always stay free and no pickup is buried; passage, though, is not guaranteed. For the ruin the generator uses its own texture pack (earth, stone, concrete, brick, metal, gravel and more) matched to the map's own colours; the pack goes into the game's folder with the map.</w:t>
+      </w:r>
+    </w:p>
+    <w:p>
+      <w:r>
+        <w:t>The «What may change» card lists the families of changes; any can be switched off.</w:t>
+      </w:r>
+    </w:p>
+    <w:p>
+      <w:r>
+        <w:t>In the «The finished map» card: «Keep the map source (.map)» leaves the source beside the finished map, for a map editor; «Shoot covers automatically» — after every finished map the program starts the game itself and takes a cover.</w:t>
+      </w:r>
+    </w:p>
+    <w:p>
+      <w:r>
+        <w:t>The generator cuts windows by itself, as many as the likeness allows: fixed glass, glass that drops when shot and comes back after a while, and glass a pressure plate on the floor opens. Windows come in different outlines - rectangular, round or oval, arched, with a transom and a vent - and with different glass: pale, blue, wired lavender and grey, amber, olive, smoke.</w:t>
+      </w:r>
+    </w:p>
+    <w:p>
+      <w:r>
+        <w:t xml:space="preserve">«Start generating» starts the work. When the map's name is taken — the library has a map of that name, a past generation's records are there, such a generation is running, queued or interrupted — the program asks first: </w:t>
+      </w:r>
+      <w:r>
+        <w:rPr>
+          <w:b/>
+        </w:rPr>
+        <w:t>Overwrite</w:t>
+      </w:r>
+      <w:r>
+        <w:t xml:space="preserve"> (the new map replaces the old one with its records), </w:t>
+      </w:r>
+      <w:r>
+        <w:rPr>
+          <w:b/>
+        </w:rPr>
+        <w:t>Correct the name</w:t>
+      </w:r>
+      <w:r>
+        <w:t xml:space="preserve"> (the page scrolls to «Map name», the cursor in it) or </w:t>
+      </w:r>
+      <w:r>
+        <w:rPr>
+          <w:b/>
+        </w:rPr>
+        <w:t>Cancel</w:t>
+      </w:r>
+      <w:r>
+        <w:t>. A running generation cannot be overwritten — only the name corrected or the generation cancelled.</w:t>
       </w:r>
     </w:p>
     <w:p>
@@ -661,7 +1109,7 @@
       <w:r>
         <w:drawing>
           <wp:inline xmlns:a="http://schemas.openxmlformats.org/drawingml/2006/main" xmlns:pic="http://schemas.openxmlformats.org/drawingml/2006/picture">
-            <wp:extent cx="6332220" cy="4185705"/>
+            <wp:extent cx="6332220" cy="4094752"/>
             <wp:docPr id="4" name="Picture 4"/>
             <wp:cNvGraphicFramePr>
               <a:graphicFrameLocks noChangeAspect="1"/>
@@ -682,7 +1130,7 @@
                   <pic:spPr>
                     <a:xfrm>
                       <a:off x="0" y="0"/>
-                      <a:ext cx="6332220" cy="4185705"/>
+                      <a:ext cx="6332220" cy="4094752"/>
                     </a:xfrm>
                     <a:prstGeom prst="rect"/>
                   </pic:spPr>
@@ -707,7 +1155,29 @@
     </w:p>
     <w:p>
       <w:r>
-        <w:t>The run's page shows:</w:t>
+        <w:t>The page is in two parts: on the left what matters about the run, on the right the map's scheme the window's whole height.</w:t>
+      </w:r>
+    </w:p>
+    <w:p>
+      <w:r>
+        <w:rPr>
+          <w:b/>
+        </w:rPr>
+        <w:t>At the top</w:t>
+      </w:r>
+      <w:r>
+        <w:t xml:space="preserve"> — the map's name and the base it is made from. Under them a coloured badge with what is going on now and its time: blue — running, yellow — paused, green — the map is ready, red — the run failed. Beside it, how long the run has gone and when it began. The buttons are on the right.</w:t>
+      </w:r>
+    </w:p>
+    <w:p>
+      <w:r>
+        <w:rPr>
+          <w:b/>
+        </w:rPr>
+        <w:t>On the left</w:t>
+      </w:r>
+      <w:r>
+        <w:t>, always open:</w:t>
       </w:r>
     </w:p>
     <w:p>
@@ -718,10 +1188,10 @@
         <w:rPr>
           <w:b/>
         </w:rPr>
-        <w:t>The stages</w:t>
-      </w:r>
-      <w:r>
-        <w:t>: Getting ready → Building the base map → Making the plan of edits → Edits → Checking it is playable → Light and visibility → The map's checks → (Destruction - when asked for) → Cover → Done. The stage under way shows its time; a finished one, when it ended.</w:t>
+        <w:t>Difference from the base</w:t>
+      </w:r>
+      <w:r>
+        <w:t xml:space="preserve"> — large, how far the map already differs from the base in percent, of how many asked, and a bar. Under it, what the plan promises: how far it can change the map in the builds allowed.</w:t>
       </w:r>
     </w:p>
     <w:p>
@@ -735,7 +1205,7 @@
         <w:t>Edits</w:t>
       </w:r>
       <w:r>
-        <w:t xml:space="preserve"> — how many were accepted, how many builds were spent of those allowed, how many were considered, and how far the map already differs from the base.</w:t>
+        <w:t xml:space="preserve"> — three numbers: how many edits were accepted (green), how many builds were made and how many edits were considered. Under them the run's time bar, and below the last edit: green when accepted, red when refused. After the edits the generator swaps liquids, moves items and tries rooms of other maps — that shows here too («N of M»).</w:t>
       </w:r>
     </w:p>
     <w:p>
@@ -746,10 +1216,21 @@
         <w:rPr>
           <w:b/>
         </w:rPr>
-        <w:t>Done of the plan</w:t>
-      </w:r>
-      <w:r>
-        <w:t xml:space="preserve"> — what of the plan was built: new passages, annexes, pools, windows, stairway annexes, rooms from the second map. Destruction comes after the edits and the checks; its percent is named in the plan's line.</w:t>
+        <w:t>The plan</w:t>
+      </w:r>
+      <w:r>
+        <w:t xml:space="preserve"> — a table: what is planned by kind (new passages, annex rooms, two-storey rooms, bridges, pools, windows, stairway annexes, remodels of the base, rooms of the second map and others), with a bar and «done of planned». A kind done turns green. Destruction comes after the edits and the checks; its percent is named under the table.</w:t>
+      </w:r>
+    </w:p>
+    <w:p>
+      <w:r>
+        <w:rPr>
+          <w:b/>
+        </w:rPr>
+        <w:t>On the left</w:t>
+      </w:r>
+      <w:r>
+        <w:t>, folded (a click on the header opens and closes it):</w:t>
       </w:r>
     </w:p>
     <w:p>
@@ -760,10 +1241,10 @@
         <w:rPr>
           <w:b/>
         </w:rPr>
-        <w:t>The map's scheme</w:t>
-      </w:r>
-      <w:r>
-        <w:t xml:space="preserve"> — the plan from above or at a slant, with the accepted changes on it (stairway annexes too, and, at the destruction stage, every crater, breach, fallen ceiling and debris pile as it is built) and, at the light stage, how the map is lit. «Full screen» puts the scheme on the whole screen; while it is there, the program's window is hidden.</w:t>
+        <w:t>Stages</w:t>
+      </w:r>
+      <w:r>
+        <w:t xml:space="preserve"> — Getting ready → Building the base map → Making the plan of edits → Edits → Checking it is playable → Light and visibility → The map's checks → (Destruction - when asked for) → Light on the finished map → Cover → Done. The stage under way shows its time; a finished one, how long it took and when it ended. The stage now is named in the folded header too.</w:t>
       </w:r>
     </w:p>
     <w:p>
@@ -774,10 +1255,21 @@
         <w:rPr>
           <w:b/>
         </w:rPr>
-        <w:t>Load</w:t>
-      </w:r>
-      <w:r>
-        <w:t xml:space="preserve"> — CPU, memory, GPU, video memory: the whole machine's and the generator's own.</w:t>
+        <w:t>Computer load</w:t>
+      </w:r>
+      <w:r>
+        <w:t xml:space="preserve"> — CPU, memory, GPU, video memory: the whole machine's and the generator's own. The header says the share of the CPU the run has.</w:t>
+      </w:r>
+    </w:p>
+    <w:p>
+      <w:r>
+        <w:rPr>
+          <w:b/>
+        </w:rPr>
+        <w:t>On the right</w:t>
+      </w:r>
+      <w:r>
+        <w:t>, two tabs:</w:t>
       </w:r>
     </w:p>
     <w:p>
@@ -788,10 +1280,86 @@
         <w:rPr>
           <w:b/>
         </w:rPr>
+        <w:t>Scheme</w:t>
+      </w:r>
+      <w:r>
+        <w:t xml:space="preserve"> — the plan from above or at a slant, with the edits on it (stairway annexes too, and, at the destruction stage, every crater, breach, fallen ceiling and debris pile as it is built) and, at the light stage, how the map is lit. The buttons over it: draw it or not, the view from above, the 3D view, the storeys up to which height, and «Full screen» — the scheme on the whole screen, the program's window hidden. </w:t>
+      </w:r>
+      <w:r>
+        <w:rPr>
+          <w:b/>
+        </w:rPr>
+        <w:t>«What the scheme shows»</w:t>
+      </w:r>
+      <w:r>
+        <w:t xml:space="preserve"> (folded) explains the signs in an even table: the edits (being tried, refused, accepted, base changed), what is still in the plan, the map's colours (floor, water, lava, slime, lifts and doors) and the items (weapons, armour, health, ammo, power-ups, spawns, teleporters). Hover a sign for the detail, e.g. «a refused edit - red, fades in 10 seconds». The mouse controls are there too.</w:t>
+      </w:r>
+    </w:p>
+    <w:p>
+      <w:pPr>
+        <w:pStyle w:val="ListBullet"/>
+      </w:pPr>
+      <w:r>
+        <w:rPr>
+          <w:b/>
+        </w:rPr>
         <w:t>Detailed log</w:t>
       </w:r>
       <w:r>
         <w:t xml:space="preserve"> — the lines the generator writes.</w:t>
+      </w:r>
+    </w:p>
+    <w:p>
+      <w:r>
+        <w:rPr>
+          <w:b/>
+        </w:rPr>
+        <w:t>The stages on the scheme.</w:t>
+      </w:r>
+      <w:r>
+        <w:t xml:space="preserve"> Each stage shows on the scheme itself:</w:t>
+      </w:r>
+    </w:p>
+    <w:p>
+      <w:pPr>
+        <w:pStyle w:val="ListBullet"/>
+      </w:pPr>
+      <w:r>
+        <w:rPr>
+          <w:b/>
+        </w:rPr>
+        <w:t>The base's frame changing</w:t>
+      </w:r>
+      <w:r>
+        <w:t xml:space="preserve"> — the scheme shows the base itself easing into its new shape and back while the generator tries the frame. Its parts are tinted apart, the orange lines are the parts' edges, the item signs move with the map. The words at the top right say the size and the parts' spread.</w:t>
+      </w:r>
+    </w:p>
+    <w:p>
+      <w:pPr>
+        <w:pStyle w:val="ListBullet"/>
+      </w:pPr>
+      <w:r>
+        <w:rPr>
+          <w:b/>
+        </w:rPr>
+        <w:t>Light and visibility — the visibility.</w:t>
+      </w:r>
+      <w:r>
+        <w:t xml:space="preserve"> The portals between the map's parts show: cyan not worked out yet, green worked out. The wave spreads from a spawn; along its front an «eye» walks with cyan sight lines to the portals checked next, the ones just reached marked by widening rings. The words say how many portals are done of how many. The 3D view shows it best: from above many portals stand edge-on.</w:t>
+      </w:r>
+    </w:p>
+    <w:p>
+      <w:pPr>
+        <w:pStyle w:val="ListBullet"/>
+      </w:pPr>
+      <w:r>
+        <w:rPr>
+          <w:b/>
+        </w:rPr>
+        <w:t>Light and visibility — the light.</w:t>
+      </w:r>
+      <w:r>
+        <w:t xml:space="preserve"> Each lamp of the map glows in its colour; rays spread from the lamps as the direct light is worked out, and the glow pulses through the bounced light. Spotlights show where they point. The words say how many lamps and how much is done.</w:t>
       </w:r>
     </w:p>
     <w:p>
@@ -852,7 +1420,7 @@
     </w:p>
     <w:p>
       <w:r>
-        <w:t>The buttons under the stages:</w:t>
+        <w:t>The buttons at the top right:</w:t>
       </w:r>
     </w:p>
     <w:p>
@@ -985,7 +1553,7 @@
     </w:p>
     <w:p>
       <w:r>
-        <w:t>«Maps» shows every finished map as a tile with its cover. The tiles are sized by the «Size» slider or by the mouse wheel with Ctrl held. «Add a map» brings any map from the disk into the library; «Refresh» rereads the folder; «Open folder» opens it in Explorer.</w:t>
+        <w:t>«Maps» shows every finished map as a tile. Over the cover — the map's base and how far it differs from it; under the cover — its name, when it was made, its size and its checks: green «checks passed» or red «failed: N». «Find by name or base» leaves only the maps that match. The tiles are sized by the «Size» slider or by the mouse wheel with Ctrl held. «Add a map» (top right) brings any map from the disk into the library; «Refresh» rereads the folder; «Open folder» opens it in Explorer.</w:t>
       </w:r>
     </w:p>
     <w:p>
@@ -1041,7 +1609,7 @@
     </w:p>
     <w:p>
       <w:r>
-        <w:t>A click on a tile opens the map:</w:t>
+        <w:t>A click on a tile opens the map. At the top its name and the same marks (base, difference, checks); beside the cover its facts (made, size, base, difference from the base, how many checks passed) and the buttons; below, its description and checks in two cards:</w:t>
       </w:r>
     </w:p>
     <w:p>
@@ -1174,6 +1742,11 @@
       </w:r>
     </w:p>
     <w:p>
+      <w:r>
+        <w:t>The settings are laid out in cards, two columns: Look, Game client, Folders, CPU load, Memory and disk, Updates. Each setting is a row: on the left what it does, on the right the setting itself.</w:t>
+      </w:r>
+    </w:p>
+    <w:p>
       <w:pPr>
         <w:pStyle w:val="ListBullet"/>
       </w:pPr>
@@ -1266,20 +1839,6 @@
       </w:r>
       <w:r>
         <w:t xml:space="preserve"> — how much free memory the generator's working files may take (the disk is then hardly used), and whether to «Keep the accepted steps on the disk» — without them an interrupted run cannot be resumed.</w:t>
-      </w:r>
-    </w:p>
-    <w:p>
-      <w:pPr>
-        <w:pStyle w:val="ListBullet"/>
-      </w:pPr>
-      <w:r>
-        <w:rPr>
-          <w:b/>
-        </w:rPr>
-        <w:t>Shoot covers automatically</w:t>
-      </w:r>
-      <w:r>
-        <w:t xml:space="preserve"> — after every finished map the program starts the game itself and takes a cover.</w:t>
       </w:r>
     </w:p>
     <w:p>
@@ -1362,7 +1921,7 @@
     </w:p>
     <w:p>
       <w:r>
-        <w:t>The program's version, «Check for updates» and the version history: what changed in each, the newest on top.</w:t>
+        <w:t>The program's version and «Check for updates» (top right), what the program is, where it and its settings file are; below, the versions' history as cards: what changed in each, the newest on top and marked.</w:t>
       </w:r>
     </w:p>
     <w:p>
@@ -1555,7 +2114,18 @@
         <w:t>data\covers</w:t>
       </w:r>
       <w:r>
-        <w:t>.</w:t>
+        <w:t xml:space="preserve"> (the game's shots are kept as JPEGs - a tenth of the PNG with the same look; the shots of earlier versions the Studio recompresses itself after it starts). The covers' small copies for the tiles are in </w:t>
+      </w:r>
+      <w:r>
+        <w:rPr>
+          <w:rFonts w:ascii="Consolas" w:hAnsi="Consolas"/>
+          <w:color w:val="404040"/>
+          <w:sz w:val="19"/>
+        </w:rPr>
+        <w:t>temp\thumbs</w:t>
+      </w:r>
+      <w:r>
+        <w:t>; they may be deleted, the Studio makes them again.</w:t>
       </w:r>
     </w:p>
     <w:p>

</xml_diff>